<commit_message>
ya saben manejas tabla de doble entrada
</commit_message>
<xml_diff>
--- a/10_parciales/parcial_1_porcentaje_15/parcial_1_del_15_porciento_abril_9_jueves.docx
+++ b/10_parciales/parcial_1_porcentaje_15/parcial_1_del_15_porciento_abril_9_jueves.docx
@@ -113,7 +113,7 @@
     <w:p>
       <w:r>
         <w:pict w14:anchorId="4D348E07">
-          <v:rect id="_x0000_i1068" style="width:0;height:1.5pt" o:hralign="center" o:hrstd="t" o:hrnoshade="t" o:hr="t" fillcolor="gray" stroked="f"/>
+          <v:rect id="_x0000_i1025" style="width:0;height:1.5pt" o:hralign="center" o:hrstd="t" o:hrnoshade="t" o:hr="t" fillcolor="gray" stroked="f"/>
         </w:pict>
       </w:r>
     </w:p>
@@ -157,7 +157,19 @@
         <w:t>Instrucciones:</w:t>
       </w:r>
       <w:r>
-        <w:t xml:space="preserve"> En la resta figuran los dígitos del 0 al 9 una sola vez. Hallar el valor de: </w:t>
+        <w:t xml:space="preserve"> En la resta figuran los dígitos del </w:t>
+      </w:r>
+      <w:r>
+        <w:t>1</w:t>
+      </w:r>
+      <w:r>
+        <w:t xml:space="preserve"> al </w:t>
+      </w:r>
+      <w:r>
+        <w:t>7</w:t>
+      </w:r>
+      <w:r>
+        <w:t xml:space="preserve"> una sola vez. Hallar el valor de: </w:t>
       </w:r>
       <w:r>
         <w:rPr>
@@ -183,12 +195,12 @@
       <w:tblGrid>
         <w:gridCol w:w="337"/>
         <w:gridCol w:w="389"/>
-        <w:gridCol w:w="410"/>
-        <w:gridCol w:w="204"/>
+        <w:gridCol w:w="389"/>
+        <w:gridCol w:w="841"/>
       </w:tblGrid>
       <w:tr>
         <w:trPr>
-          <w:tblHeader/>
+          <w:trHeight w:val="385"/>
           <w:tblCellSpacing w:w="15" w:type="dxa"/>
         </w:trPr>
         <w:tc>
@@ -209,92 +221,11 @@
             <w:vAlign w:val="center"/>
             <w:hideMark/>
           </w:tcPr>
-          <w:p/>
-        </w:tc>
-        <w:tc>
-          <w:tcPr>
-            <w:tcW w:w="0" w:type="auto"/>
-            <w:tcBorders>
-              <w:top w:val="single" w:sz="6" w:space="0" w:color="auto"/>
-              <w:left w:val="single" w:sz="6" w:space="0" w:color="auto"/>
-              <w:bottom w:val="single" w:sz="6" w:space="0" w:color="auto"/>
-              <w:right w:val="single" w:sz="6" w:space="0" w:color="auto"/>
-            </w:tcBorders>
-            <w:tcMar>
-              <w:top w:w="240" w:type="dxa"/>
-              <w:left w:w="0" w:type="dxa"/>
-              <w:bottom w:w="240" w:type="dxa"/>
-              <w:right w:w="180" w:type="dxa"/>
-            </w:tcMar>
-            <w:vAlign w:val="center"/>
-            <w:hideMark/>
-          </w:tcPr>
-          <w:p/>
-        </w:tc>
-        <w:tc>
-          <w:tcPr>
-            <w:tcW w:w="0" w:type="auto"/>
-            <w:tcBorders>
-              <w:top w:val="single" w:sz="6" w:space="0" w:color="auto"/>
-              <w:left w:val="single" w:sz="6" w:space="0" w:color="auto"/>
-              <w:bottom w:val="single" w:sz="6" w:space="0" w:color="auto"/>
-              <w:right w:val="single" w:sz="6" w:space="0" w:color="auto"/>
-            </w:tcBorders>
-            <w:tcMar>
-              <w:top w:w="240" w:type="dxa"/>
-              <w:left w:w="0" w:type="dxa"/>
-              <w:bottom w:w="240" w:type="dxa"/>
-              <w:right w:w="180" w:type="dxa"/>
-            </w:tcMar>
-            <w:vAlign w:val="center"/>
-            <w:hideMark/>
-          </w:tcPr>
-          <w:p/>
-        </w:tc>
-        <w:tc>
-          <w:tcPr>
-            <w:tcW w:w="0" w:type="auto"/>
-            <w:tcBorders>
-              <w:top w:val="single" w:sz="6" w:space="0" w:color="auto"/>
-              <w:left w:val="single" w:sz="6" w:space="0" w:color="auto"/>
-              <w:bottom w:val="single" w:sz="6" w:space="0" w:color="auto"/>
-              <w:right w:val="single" w:sz="6" w:space="0" w:color="auto"/>
-            </w:tcBorders>
-            <w:tcMar>
-              <w:top w:w="240" w:type="dxa"/>
-              <w:left w:w="0" w:type="dxa"/>
-              <w:bottom w:w="240" w:type="dxa"/>
-              <w:right w:w="0" w:type="dxa"/>
-            </w:tcMar>
-            <w:vAlign w:val="center"/>
-            <w:hideMark/>
-          </w:tcPr>
-          <w:p/>
-        </w:tc>
-      </w:tr>
-      <w:tr>
-        <w:trPr>
-          <w:tblCellSpacing w:w="15" w:type="dxa"/>
-        </w:trPr>
-        <w:tc>
-          <w:tcPr>
-            <w:tcW w:w="0" w:type="auto"/>
-            <w:tcBorders>
-              <w:top w:val="single" w:sz="6" w:space="0" w:color="auto"/>
-              <w:left w:val="single" w:sz="6" w:space="0" w:color="auto"/>
-              <w:bottom w:val="single" w:sz="6" w:space="0" w:color="auto"/>
-              <w:right w:val="single" w:sz="6" w:space="0" w:color="auto"/>
-            </w:tcBorders>
-            <w:tcMar>
-              <w:top w:w="240" w:type="dxa"/>
-              <w:left w:w="0" w:type="dxa"/>
-              <w:bottom w:w="240" w:type="dxa"/>
-              <w:right w:w="180" w:type="dxa"/>
-            </w:tcMar>
-            <w:vAlign w:val="center"/>
-            <w:hideMark/>
-          </w:tcPr>
-          <w:p/>
+          <w:p>
+            <w:pPr>
+              <w:jc w:val="center"/>
+            </w:pPr>
+          </w:p>
         </w:tc>
         <w:tc>
           <w:tcPr>
@@ -315,6 +246,9 @@
             <w:hideMark/>
           </w:tcPr>
           <w:p>
+            <w:pPr>
+              <w:jc w:val="center"/>
+            </w:pPr>
             <w:r>
               <w:rPr>
                 <w:b/>
@@ -343,6 +277,9 @@
             <w:hideMark/>
           </w:tcPr>
           <w:p>
+            <w:pPr>
+              <w:jc w:val="center"/>
+            </w:pPr>
             <w:r>
               <w:rPr>
                 <w:b/>
@@ -354,7 +291,7 @@
         </w:tc>
         <w:tc>
           <w:tcPr>
-            <w:tcW w:w="0" w:type="auto"/>
+            <w:tcW w:w="796" w:type="dxa"/>
             <w:tcBorders>
               <w:top w:val="single" w:sz="6" w:space="0" w:color="auto"/>
               <w:left w:val="single" w:sz="6" w:space="0" w:color="auto"/>
@@ -371,6 +308,9 @@
             <w:hideMark/>
           </w:tcPr>
           <w:p>
+            <w:pPr>
+              <w:jc w:val="center"/>
+            </w:pPr>
             <w:r>
               <w:t>4</w:t>
             </w:r>
@@ -400,6 +340,9 @@
             <w:hideMark/>
           </w:tcPr>
           <w:p>
+            <w:pPr>
+              <w:jc w:val="center"/>
+            </w:pPr>
             <w:r>
               <w:rPr>
                 <w:b/>
@@ -427,7 +370,11 @@
             <w:vAlign w:val="center"/>
             <w:hideMark/>
           </w:tcPr>
-          <w:p/>
+          <w:p>
+            <w:pPr>
+              <w:jc w:val="center"/>
+            </w:pPr>
+          </w:p>
         </w:tc>
         <w:tc>
           <w:tcPr>
@@ -448,6 +395,9 @@
             <w:hideMark/>
           </w:tcPr>
           <w:p>
+            <w:pPr>
+              <w:jc w:val="center"/>
+            </w:pPr>
             <w:r>
               <w:t>5</w:t>
             </w:r>
@@ -455,7 +405,7 @@
         </w:tc>
         <w:tc>
           <w:tcPr>
-            <w:tcW w:w="0" w:type="auto"/>
+            <w:tcW w:w="796" w:type="dxa"/>
             <w:tcBorders>
               <w:top w:val="single" w:sz="6" w:space="0" w:color="auto"/>
               <w:left w:val="single" w:sz="6" w:space="0" w:color="auto"/>
@@ -472,8 +422,11 @@
             <w:hideMark/>
           </w:tcPr>
           <w:p>
+            <w:pPr>
+              <w:jc w:val="center"/>
+            </w:pPr>
             <w:r>
-              <w:t>8</w:t>
+              <w:t>3</w:t>
             </w:r>
           </w:p>
         </w:tc>
@@ -500,7 +453,11 @@
             <w:vAlign w:val="center"/>
             <w:hideMark/>
           </w:tcPr>
-          <w:p/>
+          <w:p>
+            <w:pPr>
+              <w:jc w:val="center"/>
+            </w:pPr>
+          </w:p>
         </w:tc>
         <w:tc>
           <w:tcPr>
@@ -521,6 +478,9 @@
             <w:hideMark/>
           </w:tcPr>
           <w:p>
+            <w:pPr>
+              <w:jc w:val="center"/>
+            </w:pPr>
             <w:r>
               <w:t>6</w:t>
             </w:r>
@@ -545,18 +505,17 @@
             <w:hideMark/>
           </w:tcPr>
           <w:p>
+            <w:pPr>
+              <w:jc w:val="center"/>
+            </w:pPr>
             <w:r>
-              <w:rPr>
-                <w:b/>
-                <w:bCs/>
-              </w:rPr>
-              <w:t>C</w:t>
+              <w:t>2</w:t>
             </w:r>
           </w:p>
         </w:tc>
         <w:tc>
           <w:tcPr>
-            <w:tcW w:w="0" w:type="auto"/>
+            <w:tcW w:w="796" w:type="dxa"/>
             <w:tcBorders>
               <w:top w:val="single" w:sz="6" w:space="0" w:color="auto"/>
               <w:left w:val="single" w:sz="6" w:space="0" w:color="auto"/>
@@ -573,8 +532,19 @@
             <w:hideMark/>
           </w:tcPr>
           <w:p>
+            <w:pPr>
+              <w:jc w:val="center"/>
+              <w:rPr>
+                <w:b/>
+                <w:bCs/>
+              </w:rPr>
+            </w:pPr>
             <w:r>
-              <w:t>6</w:t>
+              <w:rPr>
+                <w:b/>
+                <w:bCs/>
+              </w:rPr>
+              <w:t>C</w:t>
             </w:r>
           </w:p>
         </w:tc>
@@ -601,7 +571,11 @@
             <w:vAlign w:val="center"/>
             <w:hideMark/>
           </w:tcPr>
-          <w:p/>
+          <w:p>
+            <w:pPr>
+              <w:jc w:val="center"/>
+            </w:pPr>
+          </w:p>
         </w:tc>
         <w:tc>
           <w:tcPr>
@@ -621,7 +595,11 @@
             <w:vAlign w:val="center"/>
             <w:hideMark/>
           </w:tcPr>
-          <w:p/>
+          <w:p>
+            <w:pPr>
+              <w:jc w:val="center"/>
+            </w:pPr>
+          </w:p>
         </w:tc>
         <w:tc>
           <w:tcPr>
@@ -641,11 +619,15 @@
             <w:vAlign w:val="center"/>
             <w:hideMark/>
           </w:tcPr>
-          <w:p/>
+          <w:p>
+            <w:pPr>
+              <w:jc w:val="center"/>
+            </w:pPr>
+          </w:p>
         </w:tc>
         <w:tc>
           <w:tcPr>
-            <w:tcW w:w="0" w:type="auto"/>
+            <w:tcW w:w="796" w:type="dxa"/>
             <w:tcBorders>
               <w:top w:val="single" w:sz="6" w:space="0" w:color="auto"/>
               <w:left w:val="single" w:sz="6" w:space="0" w:color="auto"/>
@@ -661,14 +643,18 @@
             <w:vAlign w:val="center"/>
             <w:hideMark/>
           </w:tcPr>
-          <w:p/>
+          <w:p>
+            <w:pPr>
+              <w:jc w:val="center"/>
+            </w:pPr>
+          </w:p>
         </w:tc>
       </w:tr>
     </w:tbl>
     <w:p>
       <w:r>
         <w:pict w14:anchorId="74397D81">
-          <v:rect id="_x0000_i1069" style="width:0;height:1.5pt" o:hralign="center" o:hrstd="t" o:hrnoshade="t" o:hr="t" fillcolor="gray" stroked="f"/>
+          <v:rect id="_x0000_i1026" style="width:0;height:1.5pt" o:hralign="center" o:hrstd="t" o:hrnoshade="t" o:hr="t" fillcolor="gray" stroked="f"/>
         </w:pict>
       </w:r>
     </w:p>
@@ -684,32 +670,32 @@
           <w:b/>
           <w:bCs/>
         </w:rPr>
+        <w:t xml:space="preserve">3. Teoría de Conjuntos (Diagramas de </w:t>
+      </w:r>
+      <w:proofErr w:type="spellStart"/>
+      <w:r>
+        <w:rPr>
+          <w:b/>
+          <w:bCs/>
+        </w:rPr>
+        <w:t>Venn</w:t>
+      </w:r>
+      <w:proofErr w:type="spellEnd"/>
+      <w:r>
+        <w:rPr>
+          <w:b/>
+          <w:bCs/>
+        </w:rPr>
+        <w:t>)</w:t>
+      </w:r>
+    </w:p>
+    <w:p>
+      <w:r>
+        <w:rPr>
+          <w:b/>
+          <w:bCs/>
+        </w:rPr>
         <w:lastRenderedPageBreak/>
-        <w:t xml:space="preserve">3. Teoría de Conjuntos (Diagramas de </w:t>
-      </w:r>
-      <w:proofErr w:type="spellStart"/>
-      <w:r>
-        <w:rPr>
-          <w:b/>
-          <w:bCs/>
-        </w:rPr>
-        <w:t>Venn</w:t>
-      </w:r>
-      <w:proofErr w:type="spellEnd"/>
-      <w:r>
-        <w:rPr>
-          <w:b/>
-          <w:bCs/>
-        </w:rPr>
-        <w:t>)</w:t>
-      </w:r>
-    </w:p>
-    <w:p>
-      <w:r>
-        <w:rPr>
-          <w:b/>
-          <w:bCs/>
-        </w:rPr>
         <w:t>El Club de Deportes:</w:t>
       </w:r>
       <w:r>
@@ -755,7 +741,7 @@
     <w:p>
       <w:r>
         <w:pict w14:anchorId="5C90AB55">
-          <v:rect id="_x0000_i1070" style="width:0;height:1.5pt" o:hralign="center" o:hrstd="t" o:hrnoshade="t" o:hr="t" fillcolor="gray" stroked="f"/>
+          <v:rect id="_x0000_i1027" style="width:0;height:1.5pt" o:hralign="center" o:hrstd="t" o:hrnoshade="t" o:hr="t" fillcolor="gray" stroked="f"/>
         </w:pict>
       </w:r>
     </w:p>
@@ -833,7 +819,7 @@
     <w:p>
       <w:r>
         <w:pict w14:anchorId="3509C441">
-          <v:rect id="_x0000_i1071" style="width:0;height:1.5pt" o:hralign="center" o:hrstd="t" o:hrnoshade="t" o:hr="t" fillcolor="gray" stroked="f"/>
+          <v:rect id="_x0000_i1028" style="width:0;height:1.5pt" o:hralign="center" o:hrstd="t" o:hrnoshade="t" o:hr="t" fillcolor="gray" stroked="f"/>
         </w:pict>
       </w:r>
     </w:p>
@@ -1036,16 +1022,16 @@
           <w:b/>
           <w:bCs/>
         </w:rPr>
+        <w:t>6. Distribución Numérica (Figuras Mágicas)</w:t>
+      </w:r>
+    </w:p>
+    <w:p>
+      <w:r>
+        <w:rPr>
+          <w:b/>
+          <w:bCs/>
+        </w:rPr>
         <w:lastRenderedPageBreak/>
-        <w:t>6. Distribución Numérica (Figuras Mágicas)</w:t>
-      </w:r>
-    </w:p>
-    <w:p>
-      <w:r>
-        <w:rPr>
-          <w:b/>
-          <w:bCs/>
-        </w:rPr>
         <w:t>El Triángulo Mágico:</w:t>
       </w:r>
       <w:r>
@@ -2331,6 +2317,7 @@
   <w:style w:type="character" w:default="1" w:styleId="Fuentedeprrafopredeter">
     <w:name w:val="Default Paragraph Font"/>
     <w:uiPriority w:val="1"/>
+    <w:semiHidden/>
     <w:unhideWhenUsed/>
   </w:style>
   <w:style w:type="table" w:default="1" w:styleId="Tablanormal">

</xml_diff>